<commit_message>
fix: verify evidence integrity before commit
</commit_message>
<xml_diff>
--- a/docs/Traceveil_Pretesting_Issues.docx
+++ b/docs/Traceveil_Pretesting_Issues.docx
@@ -153,14 +153,7 @@
           </w:tcPr>
           <w:p>
             <w:r>
-              <w:rPr>
-                <w:rFonts w:ascii="Calibri" w:hAnsi="Calibri"/>
-                <w:b w:val="0"/>
-                <w:i w:val="0"/>
-                <w:color w:val="000000"/>
-                <w:sz w:val="19"/>
-              </w:rPr>
-              <w:t>15 August 2026</w:t>
+              <w:t>15 August 2026; closure retest 26 August 2026</w:t>
             </w:r>
           </w:p>
         </w:tc>
@@ -204,14 +197,7 @@
           </w:tcPr>
           <w:p>
             <w:r>
-              <w:rPr>
-                <w:rFonts w:ascii="Calibri" w:hAnsi="Calibri"/>
-                <w:b w:val="0"/>
-                <w:i w:val="0"/>
-                <w:color w:val="000000"/>
-                <w:sz w:val="19"/>
-              </w:rPr>
-              <w:t>Working register - append live-testing findings in a later review.</w:t>
+              <w:t>Closed pre-live register - append live-testing findings as PT-07 onward.</w:t>
             </w:r>
           </w:p>
         </w:tc>
@@ -227,24 +213,7 @@
     </w:p>
     <w:p>
       <w:r>
-        <w:rPr>
-          <w:rFonts w:ascii="Calibri" w:hAnsi="Calibri"/>
-          <w:b/>
-          <w:i w:val="0"/>
-          <w:color w:val="000000"/>
-          <w:sz w:val="22"/>
-        </w:rPr>
-        <w:t xml:space="preserve">Six pretesting issues are currently open: </w:t>
-      </w:r>
-      <w:r>
-        <w:rPr>
-          <w:rFonts w:ascii="Calibri" w:hAnsi="Calibri"/>
-          <w:b w:val="0"/>
-          <w:i w:val="0"/>
-          <w:color w:val="000000"/>
-          <w:sz w:val="22"/>
-        </w:rPr>
-        <w:t>three high-severity correctness or forensic-integrity gaps, two medium-severity verification/configuration gaps, and one test-infrastructure issue. The implementation breadth is substantial, but Steps 3, 4, and 6 should not receive final sign-off until the high-severity items are resolved and regression-tested.</w:t>
+        <w:t>All six pretesting issues are closed as of 26 August 2026. The original findings remain below for traceability, followed by the fix commits and focused retest evidence used for closure. Steps 3, 4, and 6 have completed the pre-live retest gate.</w:t>
       </w:r>
     </w:p>
     <w:tbl>
@@ -503,14 +472,7 @@
           </w:tcPr>
           <w:p>
             <w:r>
-              <w:rPr>
-                <w:rFonts w:ascii="Calibri" w:hAnsi="Calibri"/>
-                <w:b/>
-                <w:i w:val="0"/>
-                <w:color w:val="000000"/>
-                <w:sz w:val="17"/>
-              </w:rPr>
-              <w:t>Open</w:t>
+              <w:t>Closed</w:t>
             </w:r>
           </w:p>
         </w:tc>
@@ -625,14 +587,7 @@
           </w:tcPr>
           <w:p>
             <w:r>
-              <w:rPr>
-                <w:rFonts w:ascii="Calibri" w:hAnsi="Calibri"/>
-                <w:b/>
-                <w:i w:val="0"/>
-                <w:color w:val="000000"/>
-                <w:sz w:val="17"/>
-              </w:rPr>
-              <w:t>Open</w:t>
+              <w:t>Closed</w:t>
             </w:r>
           </w:p>
         </w:tc>
@@ -747,14 +702,7 @@
           </w:tcPr>
           <w:p>
             <w:r>
-              <w:rPr>
-                <w:rFonts w:ascii="Calibri" w:hAnsi="Calibri"/>
-                <w:b/>
-                <w:i w:val="0"/>
-                <w:color w:val="000000"/>
-                <w:sz w:val="17"/>
-              </w:rPr>
-              <w:t>Open</w:t>
+              <w:t>Closed</w:t>
             </w:r>
           </w:p>
         </w:tc>
@@ -869,14 +817,7 @@
           </w:tcPr>
           <w:p>
             <w:r>
-              <w:rPr>
-                <w:rFonts w:ascii="Calibri" w:hAnsi="Calibri"/>
-                <w:b/>
-                <w:i w:val="0"/>
-                <w:color w:val="000000"/>
-                <w:sz w:val="17"/>
-              </w:rPr>
-              <w:t>Open</w:t>
+              <w:t>Closed</w:t>
             </w:r>
           </w:p>
         </w:tc>
@@ -991,14 +932,7 @@
           </w:tcPr>
           <w:p>
             <w:r>
-              <w:rPr>
-                <w:rFonts w:ascii="Calibri" w:hAnsi="Calibri"/>
-                <w:b/>
-                <w:i w:val="0"/>
-                <w:color w:val="000000"/>
-                <w:sz w:val="17"/>
-              </w:rPr>
-              <w:t>Open</w:t>
+              <w:t>Closed</w:t>
             </w:r>
           </w:p>
         </w:tc>
@@ -1113,14 +1047,7 @@
           </w:tcPr>
           <w:p>
             <w:r>
-              <w:rPr>
-                <w:rFonts w:ascii="Calibri" w:hAnsi="Calibri"/>
-                <w:b/>
-                <w:i w:val="0"/>
-                <w:color w:val="000000"/>
-                <w:sz w:val="17"/>
-              </w:rPr>
-              <w:t>Open</w:t>
+              <w:t>Closed</w:t>
             </w:r>
           </w:p>
         </w:tc>
@@ -1152,31 +1079,16 @@
     </w:p>
     <w:p>
       <w:pPr>
+        <w:keepNext w:val="0"/>
         <w:spacing w:after="100"/>
       </w:pPr>
       <w:r>
-        <w:rPr>
-          <w:rFonts w:ascii="Calibri" w:hAnsi="Calibri"/>
-          <w:b/>
-          <w:i w:val="0"/>
-          <w:color w:val="9B1C1C"/>
-          <w:sz w:val="19"/>
-        </w:rPr>
-        <w:t>Severity: High</w:t>
-      </w:r>
-      <w:r>
-        <w:rPr>
-          <w:rFonts w:ascii="Calibri" w:hAnsi="Calibri"/>
-          <w:b/>
-          <w:i w:val="0"/>
-          <w:color w:val="666666"/>
-          <w:sz w:val="19"/>
-        </w:rPr>
-        <w:t xml:space="preserve">    Status: Open</w:t>
+        <w:t>Severity: High    Status: Closed</w:t>
       </w:r>
     </w:p>
     <w:p>
       <w:pPr>
+        <w:keepLines/>
         <w:spacing w:after="80" w:line="276" w:lineRule="auto"/>
       </w:pPr>
       <w:r>
@@ -1202,6 +1114,7 @@
     </w:p>
     <w:p>
       <w:pPr>
+        <w:keepLines/>
         <w:spacing w:after="80" w:line="276" w:lineRule="auto"/>
       </w:pPr>
       <w:r>
@@ -1227,6 +1140,7 @@
     </w:p>
     <w:p>
       <w:pPr>
+        <w:keepLines/>
         <w:spacing w:after="80" w:line="276" w:lineRule="auto"/>
       </w:pPr>
       <w:r>
@@ -1252,6 +1166,7 @@
     </w:p>
     <w:p>
       <w:pPr>
+        <w:keepLines/>
         <w:spacing w:after="80" w:line="276" w:lineRule="auto"/>
       </w:pPr>
       <w:r>
@@ -1277,6 +1192,21 @@
     </w:p>
     <w:p>
       <w:pPr>
+        <w:keepLines/>
+        <w:spacing w:after="80"/>
+      </w:pPr>
+      <w:r>
+        <w:rPr>
+          <w:b/>
+        </w:rPr>
+        <w:t xml:space="preserve">Closure evidence (26 August 2026): </w:t>
+      </w:r>
+      <w:r>
+        <w:t>Closed. Fix commit: 887b481. Retest evidence: test_live_contract_normalizes_observed_time_and_records_ingestion_time and test_live_acceptance_rejects_caller_controlled_ingestion_fields pass; caller assignment is rejected and the trusted acceptance service records UTC ingestion time.</w:t>
+      </w:r>
+    </w:p>
+    <w:p>
+      <w:pPr>
         <w:pStyle w:val="Heading2"/>
         <w:keepNext/>
       </w:pPr>
@@ -1293,31 +1223,16 @@
     </w:p>
     <w:p>
       <w:pPr>
+        <w:keepNext w:val="0"/>
         <w:spacing w:after="100"/>
       </w:pPr>
       <w:r>
-        <w:rPr>
-          <w:rFonts w:ascii="Calibri" w:hAnsi="Calibri"/>
-          <w:b/>
-          <w:i w:val="0"/>
-          <w:color w:val="7A5A00"/>
-          <w:sz w:val="19"/>
-        </w:rPr>
-        <w:t>Severity: Medium</w:t>
-      </w:r>
-      <w:r>
-        <w:rPr>
-          <w:rFonts w:ascii="Calibri" w:hAnsi="Calibri"/>
-          <w:b/>
-          <w:i w:val="0"/>
-          <w:color w:val="666666"/>
-          <w:sz w:val="19"/>
-        </w:rPr>
-        <w:t xml:space="preserve">    Status: Open</w:t>
+        <w:t>Severity: Medium    Status: Closed</w:t>
       </w:r>
     </w:p>
     <w:p>
       <w:pPr>
+        <w:keepLines/>
         <w:spacing w:after="80" w:line="276" w:lineRule="auto"/>
       </w:pPr>
       <w:r>
@@ -1343,6 +1258,7 @@
     </w:p>
     <w:p>
       <w:pPr>
+        <w:keepLines/>
         <w:spacing w:after="80" w:line="276" w:lineRule="auto"/>
       </w:pPr>
       <w:r>
@@ -1368,6 +1284,7 @@
     </w:p>
     <w:p>
       <w:pPr>
+        <w:keepLines/>
         <w:spacing w:after="80" w:line="276" w:lineRule="auto"/>
       </w:pPr>
       <w:r>
@@ -1393,6 +1310,7 @@
     </w:p>
     <w:p>
       <w:pPr>
+        <w:keepLines/>
         <w:spacing w:after="80" w:line="276" w:lineRule="auto"/>
       </w:pPr>
       <w:r>
@@ -1414,6 +1332,21 @@
           <w:sz w:val="22"/>
         </w:rPr>
         <w:t>Run pytest with verbose teardown diagnostics, inspect active non-daemon threads/resources, isolate the responsible fixture or plugin, and require a clean zero-code process exit in CI.</w:t>
+      </w:r>
+    </w:p>
+    <w:p>
+      <w:pPr>
+        <w:keepLines/>
+        <w:spacing w:after="80"/>
+      </w:pPr>
+      <w:r>
+        <w:rPr>
+          <w:b/>
+        </w:rPr>
+        <w:t xml:space="preserve">Closure evidence (26 August 2026): </w:t>
+      </w:r>
+      <w:r>
+        <w:t>Closed. Fix commit: 887b481. Retest evidence: the clean pytest wrapper completes the full backend suite within its deadline with exit code 0, while the session-finish guard reports no leaked non-daemon thread.</w:t>
       </w:r>
     </w:p>
     <w:p>
@@ -1442,31 +1375,16 @@
     </w:p>
     <w:p>
       <w:pPr>
+        <w:keepNext w:val="0"/>
         <w:spacing w:after="100"/>
       </w:pPr>
       <w:r>
-        <w:rPr>
-          <w:rFonts w:ascii="Calibri" w:hAnsi="Calibri"/>
-          <w:b/>
-          <w:i w:val="0"/>
-          <w:color w:val="9B1C1C"/>
-          <w:sz w:val="19"/>
-        </w:rPr>
-        <w:t>Severity: High</w:t>
-      </w:r>
-      <w:r>
-        <w:rPr>
-          <w:rFonts w:ascii="Calibri" w:hAnsi="Calibri"/>
-          <w:b/>
-          <w:i w:val="0"/>
-          <w:color w:val="666666"/>
-          <w:sz w:val="19"/>
-        </w:rPr>
-        <w:t xml:space="preserve">    Status: Open</w:t>
+        <w:t>Severity: High    Status: Closed</w:t>
       </w:r>
     </w:p>
     <w:p>
       <w:pPr>
+        <w:keepLines/>
         <w:spacing w:after="80" w:line="276" w:lineRule="auto"/>
       </w:pPr>
       <w:r>
@@ -1492,6 +1410,7 @@
     </w:p>
     <w:p>
       <w:pPr>
+        <w:keepLines/>
         <w:spacing w:after="80" w:line="276" w:lineRule="auto"/>
       </w:pPr>
       <w:r>
@@ -1517,6 +1436,7 @@
     </w:p>
     <w:p>
       <w:pPr>
+        <w:keepLines/>
         <w:spacing w:after="80" w:line="276" w:lineRule="auto"/>
       </w:pPr>
       <w:r>
@@ -1542,6 +1462,7 @@
     </w:p>
     <w:p>
       <w:pPr>
+        <w:keepLines/>
         <w:spacing w:after="80" w:line="276" w:lineRule="auto"/>
       </w:pPr>
       <w:r>
@@ -1567,6 +1488,21 @@
     </w:p>
     <w:p>
       <w:pPr>
+        <w:keepLines/>
+        <w:spacing w:after="80"/>
+      </w:pPr>
+      <w:r>
+        <w:rPr>
+          <w:b/>
+        </w:rPr>
+        <w:t xml:space="preserve">Closure evidence (26 August 2026): </w:t>
+      </w:r>
+      <w:r>
+        <w:t>Closed. Fix commit: 887b481. Retest evidence: test_step4_rejects_a_self_hashed_row_without_step3_authorization rejects a forged seal, and test_commit_rejects_evidence_changed_after_validation rejects changed stored bytes before normalization or analysis.</w:t>
+      </w:r>
+    </w:p>
+    <w:p>
+      <w:pPr>
         <w:pStyle w:val="Heading2"/>
         <w:keepNext/>
       </w:pPr>
@@ -1583,31 +1519,16 @@
     </w:p>
     <w:p>
       <w:pPr>
+        <w:keepNext w:val="0"/>
         <w:spacing w:after="100"/>
       </w:pPr>
       <w:r>
-        <w:rPr>
-          <w:rFonts w:ascii="Calibri" w:hAnsi="Calibri"/>
-          <w:b/>
-          <w:i w:val="0"/>
-          <w:color w:val="7A5A00"/>
-          <w:sz w:val="19"/>
-        </w:rPr>
-        <w:t>Severity: Medium</w:t>
-      </w:r>
-      <w:r>
-        <w:rPr>
-          <w:rFonts w:ascii="Calibri" w:hAnsi="Calibri"/>
-          <w:b/>
-          <w:i w:val="0"/>
-          <w:color w:val="666666"/>
-          <w:sz w:val="19"/>
-        </w:rPr>
-        <w:t xml:space="preserve">    Status: Open</w:t>
+        <w:t>Severity: Medium    Status: Closed</w:t>
       </w:r>
     </w:p>
     <w:p>
       <w:pPr>
+        <w:keepLines/>
         <w:spacing w:after="80" w:line="276" w:lineRule="auto"/>
       </w:pPr>
       <w:r>
@@ -1633,6 +1554,7 @@
     </w:p>
     <w:p>
       <w:pPr>
+        <w:keepLines/>
         <w:spacing w:after="80" w:line="276" w:lineRule="auto"/>
       </w:pPr>
       <w:r>
@@ -1658,6 +1580,7 @@
     </w:p>
     <w:p>
       <w:pPr>
+        <w:keepLines/>
         <w:spacing w:after="80" w:line="276" w:lineRule="auto"/>
       </w:pPr>
       <w:r>
@@ -1683,6 +1606,7 @@
     </w:p>
     <w:p>
       <w:pPr>
+        <w:keepLines/>
         <w:spacing w:after="80" w:line="276" w:lineRule="auto"/>
       </w:pPr>
       <w:r>
@@ -1704,6 +1628,21 @@
           <w:sz w:val="22"/>
         </w:rPr>
         <w:t>Pin exact CASAS and TON_IoT telemetry releases/subsets; define versioned profiles, field mappings, provenance rules, and representative fixtures; implement both adapters; and verify benign, anomalous, missing-value, timestamp, identity, and device-state cases.</w:t>
+      </w:r>
+    </w:p>
+    <w:p>
+      <w:pPr>
+        <w:keepLines/>
+        <w:spacing w:after="80"/>
+      </w:pPr>
+      <w:r>
+        <w:rPr>
+          <w:b/>
+        </w:rPr>
+        <w:t xml:space="preserve">Closure evidence (26 August 2026): </w:t>
+      </w:r>
+      <w:r>
+        <w:t>Closed. Fix commits: 887b481 and 5191b7d. Retest evidence: CASAS and TON_IoT validation-profile tests and test_primary_dataset_fixtures_cross_the_step3_step4_boundary pass using the pinned representative fixtures and dedicated adapters.</w:t>
       </w:r>
     </w:p>
     <w:p>
@@ -1732,31 +1671,16 @@
     </w:p>
     <w:p>
       <w:pPr>
+        <w:keepNext w:val="0"/>
         <w:spacing w:after="100"/>
       </w:pPr>
       <w:r>
-        <w:rPr>
-          <w:rFonts w:ascii="Calibri" w:hAnsi="Calibri"/>
-          <w:b/>
-          <w:i w:val="0"/>
-          <w:color w:val="9B1C1C"/>
-          <w:sz w:val="19"/>
-        </w:rPr>
-        <w:t>Severity: High</w:t>
-      </w:r>
-      <w:r>
-        <w:rPr>
-          <w:rFonts w:ascii="Calibri" w:hAnsi="Calibri"/>
-          <w:b/>
-          <w:i w:val="0"/>
-          <w:color w:val="666666"/>
-          <w:sz w:val="19"/>
-        </w:rPr>
-        <w:t xml:space="preserve">    Status: Open</w:t>
+        <w:t>Severity: High    Status: Closed</w:t>
       </w:r>
     </w:p>
     <w:p>
       <w:pPr>
+        <w:keepLines/>
         <w:spacing w:after="80" w:line="276" w:lineRule="auto"/>
       </w:pPr>
       <w:r>
@@ -1782,6 +1706,7 @@
     </w:p>
     <w:p>
       <w:pPr>
+        <w:keepLines/>
         <w:spacing w:after="80" w:line="276" w:lineRule="auto"/>
       </w:pPr>
       <w:r>
@@ -1807,6 +1732,7 @@
     </w:p>
     <w:p>
       <w:pPr>
+        <w:keepLines/>
         <w:spacing w:after="80" w:line="276" w:lineRule="auto"/>
       </w:pPr>
       <w:r>
@@ -1832,6 +1758,7 @@
     </w:p>
     <w:p>
       <w:pPr>
+        <w:keepLines/>
         <w:spacing w:after="80" w:line="276" w:lineRule="auto"/>
       </w:pPr>
       <w:r>
@@ -1857,6 +1784,21 @@
     </w:p>
     <w:p>
       <w:pPr>
+        <w:keepLines/>
+        <w:spacing w:after="80"/>
+      </w:pPr>
+      <w:r>
+        <w:rPr>
+          <w:b/>
+        </w:rPr>
+        <w:t xml:space="preserve">Closure evidence (26 August 2026): </w:t>
+      </w:r>
+      <w:r>
+        <w:t>Closed. Fix commit: 887b481. Retest evidence: test_authentication_rule_requires_verified_actor_and_target_identities and test_authentication_rule_does_not_combine_distinct_known_actors pass; missing or unrelated identities are not grouped into AUTH-001.</w:t>
+      </w:r>
+    </w:p>
+    <w:p>
+      <w:pPr>
         <w:pStyle w:val="Heading2"/>
         <w:keepNext/>
       </w:pPr>
@@ -1873,31 +1815,16 @@
     </w:p>
     <w:p>
       <w:pPr>
+        <w:keepNext w:val="0"/>
         <w:spacing w:after="100"/>
       </w:pPr>
       <w:r>
-        <w:rPr>
-          <w:rFonts w:ascii="Calibri" w:hAnsi="Calibri"/>
-          <w:b/>
-          <w:i w:val="0"/>
-          <w:color w:val="7A5A00"/>
-          <w:sz w:val="19"/>
-        </w:rPr>
-        <w:t>Severity: Medium</w:t>
-      </w:r>
-      <w:r>
-        <w:rPr>
-          <w:rFonts w:ascii="Calibri" w:hAnsi="Calibri"/>
-          <w:b/>
-          <w:i w:val="0"/>
-          <w:color w:val="666666"/>
-          <w:sz w:val="19"/>
-        </w:rPr>
-        <w:t xml:space="preserve">    Status: Open</w:t>
+        <w:t>Severity: Medium    Status: Closed</w:t>
       </w:r>
     </w:p>
     <w:p>
       <w:pPr>
+        <w:keepLines/>
         <w:spacing w:after="80" w:line="276" w:lineRule="auto"/>
       </w:pPr>
       <w:r>
@@ -1923,6 +1850,7 @@
     </w:p>
     <w:p>
       <w:pPr>
+        <w:keepLines/>
         <w:spacing w:after="80" w:line="276" w:lineRule="auto"/>
       </w:pPr>
       <w:r>
@@ -1948,6 +1876,7 @@
     </w:p>
     <w:p>
       <w:pPr>
+        <w:keepLines/>
         <w:spacing w:after="80" w:line="276" w:lineRule="auto"/>
       </w:pPr>
       <w:r>
@@ -1973,6 +1902,7 @@
     </w:p>
     <w:p>
       <w:pPr>
+        <w:keepLines/>
         <w:spacing w:after="80" w:line="276" w:lineRule="auto"/>
       </w:pPr>
       <w:r>
@@ -1994,6 +1924,21 @@
           <w:sz w:val="22"/>
         </w:rPr>
         <w:t>Define rule-specific repetition semantics, place every threshold in AnalysisConfig, document it in the contract, and add exact factor/score golden assertions.</w:t>
+      </w:r>
+    </w:p>
+    <w:p>
+      <w:pPr>
+        <w:keepLines/>
+        <w:spacing w:after="80"/>
+      </w:pPr>
+      <w:r>
+        <w:rPr>
+          <w:b/>
+        </w:rPr>
+        <w:t xml:space="preserve">Closure evidence (26 August 2026): </w:t>
+      </w:r>
+      <w:r>
+        <w:t>Closed. Fix commit: 887b481. Retest evidence: test_default_label_risk_has_a_versioned_repetition_reference and the bounded risk configuration tests pass; rule-specific repetition references are explicit in AnalysisConfig and the deterministic-analysis contract.</w:t>
       </w:r>
     </w:p>
     <w:p>
@@ -2218,10 +2163,7 @@
         <w:keepLines/>
       </w:pPr>
       <w:r>
-        <w:rPr>
-          <w:i w:val="0"/>
-        </w:rPr>
-        <w:t>Add analysis orchestration over persisted canonical events, including validated filters, explicit configuration selection, idempotent reanalysis, and failure handling.</w:t>
+        <w:t>Add analysis orchestration over persisted canonical events, including validated filters, the versioned default configuration, idempotent reanalysis, and failure handling. Explicit client-selected analysis configuration is outside this release and is rejected rather than silently ignored.</w:t>
       </w:r>
     </w:p>
     <w:p>
@@ -2331,6 +2273,7 @@
     <w:p>
       <w:pPr>
         <w:pStyle w:val="ListBullet"/>
+        <w:keepNext/>
         <w:spacing w:after="80"/>
       </w:pPr>
       <w:r>
@@ -2347,6 +2290,7 @@
     <w:p>
       <w:pPr>
         <w:pStyle w:val="ListBullet"/>
+        <w:keepNext/>
         <w:spacing w:after="80"/>
       </w:pPr>
       <w:r>
@@ -2363,6 +2307,7 @@
     <w:p>
       <w:pPr>
         <w:pStyle w:val="ListBullet"/>
+        <w:keepNext/>
         <w:spacing w:after="80"/>
       </w:pPr>
       <w:r>
@@ -2379,6 +2324,7 @@
     <w:p>
       <w:pPr>
         <w:pStyle w:val="ListBullet"/>
+        <w:keepNext/>
         <w:spacing w:after="80"/>
       </w:pPr>
       <w:r>

</xml_diff>